<commit_message>
Data Analyzation and Visualization using R
</commit_message>
<xml_diff>
--- a/Case Study 1 How does a bike-share navigate speedy success/report 1.docx
+++ b/Case Study 1 How does a bike-share navigate speedy success/report 1.docx
@@ -25,20 +25,62 @@
         <w:rPr>
           <w:lang w:val="en-US"/>
         </w:rPr>
-        <w:t>Business Task : How do annual members and casual riders use Cyclistic bikes differently</w:t>
-      </w:r>
-    </w:p>
-    <w:p>
-      <w:pPr>
-        <w:rPr>
-          <w:lang w:val="en-US"/>
-        </w:rPr>
-      </w:pPr>
-      <w:r>
-        <w:rPr>
-          <w:lang w:val="en-US"/>
-        </w:rPr>
-        <w:t xml:space="preserve">Stakeholders : Cyclistic marketing analytics team , Cyclistic executive team , Director of marketing </w:t>
+        <w:t xml:space="preserve">Business Task : How do annual members and casual riders use </w:t>
+      </w:r>
+      <w:proofErr w:type="spellStart"/>
+      <w:r>
+        <w:rPr>
+          <w:lang w:val="en-US"/>
+        </w:rPr>
+        <w:t>Cyclistic</w:t>
+      </w:r>
+      <w:proofErr w:type="spellEnd"/>
+      <w:r>
+        <w:rPr>
+          <w:lang w:val="en-US"/>
+        </w:rPr>
+        <w:t xml:space="preserve"> bikes differently</w:t>
+      </w:r>
+    </w:p>
+    <w:p>
+      <w:pPr>
+        <w:rPr>
+          <w:lang w:val="en-US"/>
+        </w:rPr>
+      </w:pPr>
+      <w:r>
+        <w:rPr>
+          <w:lang w:val="en-US"/>
+        </w:rPr>
+        <w:t xml:space="preserve">Stakeholders : </w:t>
+      </w:r>
+      <w:proofErr w:type="spellStart"/>
+      <w:r>
+        <w:rPr>
+          <w:lang w:val="en-US"/>
+        </w:rPr>
+        <w:t>Cyclistic</w:t>
+      </w:r>
+      <w:proofErr w:type="spellEnd"/>
+      <w:r>
+        <w:rPr>
+          <w:lang w:val="en-US"/>
+        </w:rPr>
+        <w:t xml:space="preserve"> marketing analytics team , </w:t>
+      </w:r>
+      <w:proofErr w:type="spellStart"/>
+      <w:r>
+        <w:rPr>
+          <w:lang w:val="en-US"/>
+        </w:rPr>
+        <w:t>Cyclistic</w:t>
+      </w:r>
+      <w:proofErr w:type="spellEnd"/>
+      <w:r>
+        <w:rPr>
+          <w:lang w:val="en-US"/>
+        </w:rPr>
+        <w:t xml:space="preserve"> executive team , Director of marketing </w:t>
       </w:r>
     </w:p>
     <w:p>
@@ -96,7 +138,21 @@
         <w:rPr>
           <w:lang w:val="en-US"/>
         </w:rPr>
-        <w:t>-2023/05) 12 months of Cyclistic trip data</w:t>
+        <w:t xml:space="preserve">-2023/05) 12 months of </w:t>
+      </w:r>
+      <w:proofErr w:type="spellStart"/>
+      <w:r>
+        <w:rPr>
+          <w:lang w:val="en-US"/>
+        </w:rPr>
+        <w:t>Cyclistic</w:t>
+      </w:r>
+      <w:proofErr w:type="spellEnd"/>
+      <w:r>
+        <w:rPr>
+          <w:lang w:val="en-US"/>
+        </w:rPr>
+        <w:t xml:space="preserve"> trip data</w:t>
       </w:r>
     </w:p>
     <w:p>
@@ -130,6 +186,143 @@
         </w:rPr>
         <w:t xml:space="preserve"> , Removed Duplicates</w:t>
       </w:r>
+    </w:p>
+    <w:p>
+      <w:pPr>
+        <w:rPr>
+          <w:lang w:val="en-US"/>
+        </w:rPr>
+      </w:pPr>
+    </w:p>
+    <w:p>
+      <w:pPr>
+        <w:rPr>
+          <w:lang w:val="en-US"/>
+        </w:rPr>
+      </w:pPr>
+      <w:r>
+        <w:rPr>
+          <w:lang w:val="en-US"/>
+        </w:rPr>
+        <w:t>Phase 3 (Process):</w:t>
+      </w:r>
+    </w:p>
+    <w:p>
+      <w:pPr>
+        <w:rPr>
+          <w:lang w:val="en-US"/>
+        </w:rPr>
+      </w:pPr>
+      <w:r>
+        <w:rPr>
+          <w:lang w:val="en-US"/>
+        </w:rPr>
+        <w:t>Calculated the ride length , Day of week</w:t>
+      </w:r>
+      <w:r>
+        <w:rPr>
+          <w:lang w:val="en-US"/>
+        </w:rPr>
+        <w:t xml:space="preserve"> (1=Sunday , 7 = Saturday )</w:t>
+      </w:r>
+    </w:p>
+    <w:p>
+      <w:pPr>
+        <w:rPr>
+          <w:lang w:val="en-US"/>
+        </w:rPr>
+      </w:pPr>
+      <w:r>
+        <w:rPr>
+          <w:lang w:val="en-US"/>
+        </w:rPr>
+        <w:t xml:space="preserve">Transformed to </w:t>
+      </w:r>
+      <w:r>
+        <w:rPr>
+          <w:lang w:val="en-US"/>
+        </w:rPr>
+        <w:t>Time</w:t>
+      </w:r>
+      <w:r>
+        <w:rPr>
+          <w:lang w:val="en-US"/>
+        </w:rPr>
+        <w:t xml:space="preserve"> Format</w:t>
+      </w:r>
+    </w:p>
+    <w:p>
+      <w:pPr>
+        <w:rPr>
+          <w:lang w:val="en-US"/>
+        </w:rPr>
+      </w:pPr>
+    </w:p>
+    <w:p>
+      <w:pPr>
+        <w:rPr>
+          <w:lang w:val="en-US"/>
+        </w:rPr>
+      </w:pPr>
+      <w:r>
+        <w:rPr>
+          <w:lang w:val="en-US"/>
+        </w:rPr>
+        <w:t>Phase 4 (Analyze):</w:t>
+      </w:r>
+      <w:r>
+        <w:rPr>
+          <w:lang w:val="en-US"/>
+        </w:rPr>
+        <w:br/>
+        <w:t>Mean ride length , Maximum ride length , Mode of day of week</w:t>
+      </w:r>
+    </w:p>
+    <w:p>
+      <w:pPr>
+        <w:rPr>
+          <w:lang w:val="en-US"/>
+        </w:rPr>
+      </w:pPr>
+      <w:r>
+        <w:rPr>
+          <w:lang w:val="en-US"/>
+        </w:rPr>
+        <w:t>Pivot table ( average ride length , Count  of ride length for each day of week )</w:t>
+      </w:r>
+    </w:p>
+    <w:p>
+      <w:pPr>
+        <w:rPr>
+          <w:lang w:val="en-US"/>
+        </w:rPr>
+      </w:pPr>
+      <w:r>
+        <w:rPr>
+          <w:lang w:val="en-US"/>
+        </w:rPr>
+        <w:t>Pivot table ( average ride length , Maximum ride length for casual and member )</w:t>
+      </w:r>
+    </w:p>
+    <w:p>
+      <w:pPr>
+        <w:rPr>
+          <w:rFonts w:ascii="Calibri" w:eastAsia="Times New Roman" w:hAnsi="Calibri" w:cs="Calibri"/>
+          <w:b/>
+          <w:bCs/>
+          <w:color w:val="000000"/>
+          <w:kern w:val="0"/>
+          <w:lang w:val="en-US" w:eastAsia="en-IM"/>
+          <w14:ligatures w14:val="none"/>
+        </w:rPr>
+      </w:pPr>
+    </w:p>
+    <w:p>
+      <w:pPr>
+        <w:rPr>
+          <w:lang w:val="en-US"/>
+        </w:rPr>
+      </w:pPr>
     </w:p>
     <w:p>
       <w:pPr>

</xml_diff>